<commit_message>
3.Docker + bo sung minh chung
</commit_message>
<xml_diff>
--- a/Tuan05/Docker-compose.docx
+++ b/Tuan05/Docker-compose.docx
@@ -64,10 +64,10 @@
                 <w:rFonts w:ascii="Times New Roman" w:hAnsi="Times New Roman" w:cs="Times New Roman"/>
               </w:rPr>
               <w:drawing>
-                <wp:inline distT="0" distB="0" distL="0" distR="0" wp14:anchorId="501D9DBE" wp14:editId="1B39678E">
-                  <wp:extent cx="5334744" cy="752580"/>
-                  <wp:effectExtent l="0" t="0" r="0" b="9525"/>
-                  <wp:docPr id="1452182332" name="Picture 1"/>
+                <wp:inline distT="0" distB="0" distL="0" distR="0" wp14:anchorId="0FB8F7EE" wp14:editId="460C1A5C">
+                  <wp:extent cx="5943600" cy="413385"/>
+                  <wp:effectExtent l="0" t="0" r="0" b="5715"/>
+                  <wp:docPr id="1424869476" name="Picture 1"/>
                   <wp:cNvGraphicFramePr>
                     <a:graphicFrameLocks xmlns:a="http://schemas.openxmlformats.org/drawingml/2006/main" noChangeAspect="1"/>
                   </wp:cNvGraphicFramePr>
@@ -75,7 +75,7 @@
                     <a:graphicData uri="http://schemas.openxmlformats.org/drawingml/2006/picture">
                       <pic:pic xmlns:pic="http://schemas.openxmlformats.org/drawingml/2006/picture">
                         <pic:nvPicPr>
-                          <pic:cNvPr id="1452182332" name=""/>
+                          <pic:cNvPr id="1424869476" name=""/>
                           <pic:cNvPicPr/>
                         </pic:nvPicPr>
                         <pic:blipFill>
@@ -87,7 +87,7 @@
                         <pic:spPr>
                           <a:xfrm>
                             <a:off x="0" y="0"/>
-                            <a:ext cx="5334744" cy="752580"/>
+                            <a:ext cx="5943600" cy="413385"/>
                           </a:xfrm>
                           <a:prstGeom prst="rect">
                             <a:avLst/>
@@ -174,10 +174,10 @@
                 <w:rFonts w:ascii="Times New Roman" w:hAnsi="Times New Roman" w:cs="Times New Roman"/>
               </w:rPr>
               <w:drawing>
-                <wp:inline distT="0" distB="0" distL="0" distR="0" wp14:anchorId="58081DF6" wp14:editId="4A725A95">
-                  <wp:extent cx="5458587" cy="685896"/>
-                  <wp:effectExtent l="0" t="0" r="0" b="0"/>
-                  <wp:docPr id="282696821" name="Picture 1"/>
+                <wp:inline distT="0" distB="0" distL="0" distR="0" wp14:anchorId="3EC7B30B" wp14:editId="0E2C7561">
+                  <wp:extent cx="5943600" cy="1575435"/>
+                  <wp:effectExtent l="0" t="0" r="0" b="5715"/>
+                  <wp:docPr id="457320317" name="Picture 1"/>
                   <wp:cNvGraphicFramePr>
                     <a:graphicFrameLocks xmlns:a="http://schemas.openxmlformats.org/drawingml/2006/main" noChangeAspect="1"/>
                   </wp:cNvGraphicFramePr>
@@ -185,7 +185,7 @@
                     <a:graphicData uri="http://schemas.openxmlformats.org/drawingml/2006/picture">
                       <pic:pic xmlns:pic="http://schemas.openxmlformats.org/drawingml/2006/picture">
                         <pic:nvPicPr>
-                          <pic:cNvPr id="282696821" name=""/>
+                          <pic:cNvPr id="457320317" name=""/>
                           <pic:cNvPicPr/>
                         </pic:nvPicPr>
                         <pic:blipFill>
@@ -197,7 +197,7 @@
                         <pic:spPr>
                           <a:xfrm>
                             <a:off x="0" y="0"/>
-                            <a:ext cx="5458587" cy="685896"/>
+                            <a:ext cx="5943600" cy="1575435"/>
                           </a:xfrm>
                           <a:prstGeom prst="rect">
                             <a:avLst/>
@@ -216,15 +216,78 @@
                 <w:rFonts w:ascii="Times New Roman" w:hAnsi="Times New Roman" w:cs="Times New Roman"/>
               </w:rPr>
             </w:pPr>
+          </w:p>
+        </w:tc>
+        <w:tc>
+          <w:tcPr>
+            <w:tcW w:w="0" w:type="auto"/>
+            <w:hideMark/>
+          </w:tcPr>
+          <w:p>
+            <w:pPr>
+              <w:rPr>
+                <w:rFonts w:ascii="Times New Roman" w:hAnsi="Times New Roman" w:cs="Times New Roman"/>
+              </w:rPr>
+            </w:pPr>
+          </w:p>
+        </w:tc>
+      </w:tr>
+      <w:tr>
+        <w:trPr>
+          <w:trHeight w:val="315"/>
+        </w:trPr>
+        <w:tc>
+          <w:tcPr>
+            <w:tcW w:w="567" w:type="dxa"/>
+            <w:hideMark/>
+          </w:tcPr>
+          <w:p>
+            <w:pPr>
+              <w:rPr>
+                <w:rFonts w:ascii="Times New Roman" w:hAnsi="Times New Roman" w:cs="Times New Roman"/>
+              </w:rPr>
+            </w:pPr>
+            <w:r>
+              <w:rPr>
+                <w:rFonts w:ascii="Times New Roman" w:hAnsi="Times New Roman" w:cs="Times New Roman"/>
+              </w:rPr>
+              <w:t>3</w:t>
+            </w:r>
+          </w:p>
+        </w:tc>
+        <w:tc>
+          <w:tcPr>
+            <w:tcW w:w="0" w:type="auto"/>
+            <w:hideMark/>
+          </w:tcPr>
+          <w:p>
+            <w:pPr>
+              <w:rPr>
+                <w:rFonts w:ascii="Times New Roman" w:hAnsi="Times New Roman" w:cs="Times New Roman"/>
+              </w:rPr>
+            </w:pPr>
+            <w:r>
+              <w:rPr>
+                <w:rFonts w:ascii="Times New Roman" w:hAnsi="Times New Roman" w:cs="Times New Roman"/>
+              </w:rPr>
+              <w:t>docker compose up -d</w:t>
+            </w:r>
+          </w:p>
+          <w:p>
+            <w:pPr>
+              <w:rPr>
+                <w:rFonts w:ascii="Times New Roman" w:hAnsi="Times New Roman" w:cs="Times New Roman"/>
+              </w:rPr>
+            </w:pPr>
             <w:r>
               <w:rPr>
                 <w:rFonts w:ascii="Times New Roman" w:hAnsi="Times New Roman" w:cs="Times New Roman"/>
               </w:rPr>
               <w:drawing>
-                <wp:inline distT="0" distB="0" distL="0" distR="0" wp14:anchorId="19AD9741" wp14:editId="3390680A">
-                  <wp:extent cx="5943600" cy="807720"/>
-                  <wp:effectExtent l="0" t="0" r="0" b="0"/>
-                  <wp:docPr id="133735923" name="Picture 1"/>
+                <wp:inline distT="0" distB="0" distL="0" distR="0" wp14:anchorId="2873410C" wp14:editId="68933329">
+                  <wp:extent cx="5943600" cy="775335"/>
+                  <wp:effectExtent l="0" t="0" r="0" b="5715"/>
+                  <wp:docPr id="890828186" name="Picture 1"/>
                   <wp:cNvGraphicFramePr>
                     <a:graphicFrameLocks xmlns:a="http://schemas.openxmlformats.org/drawingml/2006/main" noChangeAspect="1"/>
                   </wp:cNvGraphicFramePr>
@@ -232,7 +295,7 @@
                     <a:graphicData uri="http://schemas.openxmlformats.org/drawingml/2006/picture">
                       <pic:pic xmlns:pic="http://schemas.openxmlformats.org/drawingml/2006/picture">
                         <pic:nvPicPr>
-                          <pic:cNvPr id="133735923" name=""/>
+                          <pic:cNvPr id="890828186" name=""/>
                           <pic:cNvPicPr/>
                         </pic:nvPicPr>
                         <pic:blipFill>
@@ -244,7 +307,7 @@
                         <pic:spPr>
                           <a:xfrm>
                             <a:off x="0" y="0"/>
-                            <a:ext cx="5943600" cy="807720"/>
+                            <a:ext cx="5943600" cy="775335"/>
                           </a:xfrm>
                           <a:prstGeom prst="rect">
                             <a:avLst/>
@@ -264,13 +327,6 @@
               </w:rPr>
             </w:pPr>
           </w:p>
-          <w:p>
-            <w:pPr>
-              <w:rPr>
-                <w:rFonts w:ascii="Times New Roman" w:hAnsi="Times New Roman" w:cs="Times New Roman"/>
-              </w:rPr>
-            </w:pPr>
-          </w:p>
         </w:tc>
         <w:tc>
           <w:tcPr>
@@ -305,7 +361,7 @@
               <w:rPr>
                 <w:rFonts w:ascii="Times New Roman" w:hAnsi="Times New Roman" w:cs="Times New Roman"/>
               </w:rPr>
-              <w:t>3</w:t>
+              <w:t>4</w:t>
             </w:r>
           </w:p>
         </w:tc>
@@ -324,7 +380,7 @@
               <w:rPr>
                 <w:rFonts w:ascii="Times New Roman" w:hAnsi="Times New Roman" w:cs="Times New Roman"/>
               </w:rPr>
-              <w:t>docker compose up -d</w:t>
+              <w:t>docker compose ps</w:t>
             </w:r>
           </w:p>
           <w:p>
@@ -338,10 +394,10 @@
                 <w:rFonts w:ascii="Times New Roman" w:hAnsi="Times New Roman" w:cs="Times New Roman"/>
               </w:rPr>
               <w:drawing>
-                <wp:inline distT="0" distB="0" distL="0" distR="0" wp14:anchorId="50D21D05" wp14:editId="27B0214F">
-                  <wp:extent cx="5943600" cy="1026795"/>
-                  <wp:effectExtent l="0" t="0" r="0" b="1905"/>
-                  <wp:docPr id="1159131644" name="Picture 1"/>
+                <wp:inline distT="0" distB="0" distL="0" distR="0" wp14:anchorId="4C0EDC96" wp14:editId="71314E31">
+                  <wp:extent cx="5943600" cy="1316990"/>
+                  <wp:effectExtent l="0" t="0" r="0" b="0"/>
+                  <wp:docPr id="2101865377" name="Picture 1"/>
                   <wp:cNvGraphicFramePr>
                     <a:graphicFrameLocks xmlns:a="http://schemas.openxmlformats.org/drawingml/2006/main" noChangeAspect="1"/>
                   </wp:cNvGraphicFramePr>
@@ -349,7 +405,7 @@
                     <a:graphicData uri="http://schemas.openxmlformats.org/drawingml/2006/picture">
                       <pic:pic xmlns:pic="http://schemas.openxmlformats.org/drawingml/2006/picture">
                         <pic:nvPicPr>
-                          <pic:cNvPr id="1159131644" name=""/>
+                          <pic:cNvPr id="2101865377" name=""/>
                           <pic:cNvPicPr/>
                         </pic:nvPicPr>
                         <pic:blipFill>
@@ -361,7 +417,7 @@
                         <pic:spPr>
                           <a:xfrm>
                             <a:off x="0" y="0"/>
-                            <a:ext cx="5943600" cy="1026795"/>
+                            <a:ext cx="5943600" cy="1316990"/>
                           </a:xfrm>
                           <a:prstGeom prst="rect">
                             <a:avLst/>
@@ -374,6 +430,13 @@
               </w:drawing>
             </w:r>
           </w:p>
+          <w:p>
+            <w:pPr>
+              <w:rPr>
+                <w:rFonts w:ascii="Times New Roman" w:hAnsi="Times New Roman" w:cs="Times New Roman"/>
+              </w:rPr>
+            </w:pPr>
+          </w:p>
         </w:tc>
         <w:tc>
           <w:tcPr>
@@ -408,7 +471,7 @@
               <w:rPr>
                 <w:rFonts w:ascii="Times New Roman" w:hAnsi="Times New Roman" w:cs="Times New Roman"/>
               </w:rPr>
-              <w:t>4</w:t>
+              <w:t>5</w:t>
             </w:r>
           </w:p>
         </w:tc>
@@ -427,7 +490,7 @@
               <w:rPr>
                 <w:rFonts w:ascii="Times New Roman" w:hAnsi="Times New Roman" w:cs="Times New Roman"/>
               </w:rPr>
-              <w:t>docker compose ps</w:t>
+              <w:t>docker compose down</w:t>
             </w:r>
           </w:p>
           <w:p>
@@ -441,10 +504,10 @@
                 <w:rFonts w:ascii="Times New Roman" w:hAnsi="Times New Roman" w:cs="Times New Roman"/>
               </w:rPr>
               <w:drawing>
-                <wp:inline distT="0" distB="0" distL="0" distR="0" wp14:anchorId="6784290F" wp14:editId="542820D4">
-                  <wp:extent cx="5943600" cy="1096645"/>
-                  <wp:effectExtent l="0" t="0" r="0" b="8255"/>
-                  <wp:docPr id="1867300541" name="Picture 1"/>
+                <wp:inline distT="0" distB="0" distL="0" distR="0" wp14:anchorId="02C324A5" wp14:editId="13618A90">
+                  <wp:extent cx="5943600" cy="972820"/>
+                  <wp:effectExtent l="0" t="0" r="0" b="0"/>
+                  <wp:docPr id="491321639" name="Picture 1"/>
                   <wp:cNvGraphicFramePr>
                     <a:graphicFrameLocks xmlns:a="http://schemas.openxmlformats.org/drawingml/2006/main" noChangeAspect="1"/>
                   </wp:cNvGraphicFramePr>
@@ -452,7 +515,7 @@
                     <a:graphicData uri="http://schemas.openxmlformats.org/drawingml/2006/picture">
                       <pic:pic xmlns:pic="http://schemas.openxmlformats.org/drawingml/2006/picture">
                         <pic:nvPicPr>
-                          <pic:cNvPr id="1867300541" name=""/>
+                          <pic:cNvPr id="491321639" name=""/>
                           <pic:cNvPicPr/>
                         </pic:nvPicPr>
                         <pic:blipFill>
@@ -464,7 +527,7 @@
                         <pic:spPr>
                           <a:xfrm>
                             <a:off x="0" y="0"/>
-                            <a:ext cx="5943600" cy="1096645"/>
+                            <a:ext cx="5943600" cy="972820"/>
                           </a:xfrm>
                           <a:prstGeom prst="rect">
                             <a:avLst/>
@@ -477,6 +540,13 @@
               </w:drawing>
             </w:r>
           </w:p>
+          <w:p>
+            <w:pPr>
+              <w:rPr>
+                <w:rFonts w:ascii="Times New Roman" w:hAnsi="Times New Roman" w:cs="Times New Roman"/>
+              </w:rPr>
+            </w:pPr>
+          </w:p>
         </w:tc>
         <w:tc>
           <w:tcPr>
@@ -511,7 +581,7 @@
               <w:rPr>
                 <w:rFonts w:ascii="Times New Roman" w:hAnsi="Times New Roman" w:cs="Times New Roman"/>
               </w:rPr>
-              <w:t>5</w:t>
+              <w:t>6</w:t>
             </w:r>
           </w:p>
         </w:tc>
@@ -530,24 +600,25 @@
               <w:rPr>
                 <w:rFonts w:ascii="Times New Roman" w:hAnsi="Times New Roman" w:cs="Times New Roman"/>
               </w:rPr>
-              <w:t>docker compose down</w:t>
-            </w:r>
-          </w:p>
-          <w:p>
-            <w:pPr>
-              <w:rPr>
-                <w:rFonts w:ascii="Times New Roman" w:hAnsi="Times New Roman" w:cs="Times New Roman"/>
-              </w:rPr>
-            </w:pPr>
-            <w:r>
-              <w:rPr>
-                <w:rFonts w:ascii="Times New Roman" w:hAnsi="Times New Roman" w:cs="Times New Roman"/>
-              </w:rPr>
+              <w:t>docker compose restart</w:t>
+            </w:r>
+          </w:p>
+          <w:p>
+            <w:pPr>
+              <w:rPr>
+                <w:rFonts w:ascii="Times New Roman" w:hAnsi="Times New Roman" w:cs="Times New Roman"/>
+              </w:rPr>
+            </w:pPr>
+            <w:r>
+              <w:rPr>
+                <w:rFonts w:ascii="Times New Roman" w:hAnsi="Times New Roman" w:cs="Times New Roman"/>
+              </w:rPr>
+              <w:lastRenderedPageBreak/>
               <w:drawing>
-                <wp:inline distT="0" distB="0" distL="0" distR="0" wp14:anchorId="49EA4719" wp14:editId="3BB666D8">
-                  <wp:extent cx="5943600" cy="940435"/>
+                <wp:inline distT="0" distB="0" distL="0" distR="0" wp14:anchorId="4B51DFF7" wp14:editId="1F09E059">
+                  <wp:extent cx="5943600" cy="1717675"/>
                   <wp:effectExtent l="0" t="0" r="0" b="0"/>
-                  <wp:docPr id="1864796900" name="Picture 1"/>
+                  <wp:docPr id="810899920" name="Picture 1"/>
                   <wp:cNvGraphicFramePr>
                     <a:graphicFrameLocks xmlns:a="http://schemas.openxmlformats.org/drawingml/2006/main" noChangeAspect="1"/>
                   </wp:cNvGraphicFramePr>
@@ -555,7 +626,7 @@
                     <a:graphicData uri="http://schemas.openxmlformats.org/drawingml/2006/picture">
                       <pic:pic xmlns:pic="http://schemas.openxmlformats.org/drawingml/2006/picture">
                         <pic:nvPicPr>
-                          <pic:cNvPr id="1864796900" name=""/>
+                          <pic:cNvPr id="810899920" name=""/>
                           <pic:cNvPicPr/>
                         </pic:nvPicPr>
                         <pic:blipFill>
@@ -567,7 +638,7 @@
                         <pic:spPr>
                           <a:xfrm>
                             <a:off x="0" y="0"/>
-                            <a:ext cx="5943600" cy="940435"/>
+                            <a:ext cx="5943600" cy="1717675"/>
                           </a:xfrm>
                           <a:prstGeom prst="rect">
                             <a:avLst/>
@@ -580,6 +651,13 @@
               </w:drawing>
             </w:r>
           </w:p>
+          <w:p>
+            <w:pPr>
+              <w:rPr>
+                <w:rFonts w:ascii="Times New Roman" w:hAnsi="Times New Roman" w:cs="Times New Roman"/>
+              </w:rPr>
+            </w:pPr>
+          </w:p>
         </w:tc>
         <w:tc>
           <w:tcPr>
@@ -614,8 +692,7 @@
               <w:rPr>
                 <w:rFonts w:ascii="Times New Roman" w:hAnsi="Times New Roman" w:cs="Times New Roman"/>
               </w:rPr>
-              <w:lastRenderedPageBreak/>
-              <w:t>6</w:t>
+              <w:t>7</w:t>
             </w:r>
           </w:p>
         </w:tc>
@@ -634,7 +711,7 @@
               <w:rPr>
                 <w:rFonts w:ascii="Times New Roman" w:hAnsi="Times New Roman" w:cs="Times New Roman"/>
               </w:rPr>
-              <w:t>docker compose restart</w:t>
+              <w:t>docker compose logs -f</w:t>
             </w:r>
           </w:p>
           <w:p>
@@ -648,10 +725,10 @@
                 <w:rFonts w:ascii="Times New Roman" w:hAnsi="Times New Roman" w:cs="Times New Roman"/>
               </w:rPr>
               <w:drawing>
-                <wp:inline distT="0" distB="0" distL="0" distR="0" wp14:anchorId="739510CF" wp14:editId="38B2C1FF">
-                  <wp:extent cx="5943600" cy="412115"/>
-                  <wp:effectExtent l="0" t="0" r="0" b="6985"/>
-                  <wp:docPr id="1347007219" name="Picture 1"/>
+                <wp:inline distT="0" distB="0" distL="0" distR="0" wp14:anchorId="36F0F1B4" wp14:editId="54754A80">
+                  <wp:extent cx="5943600" cy="1794510"/>
+                  <wp:effectExtent l="0" t="0" r="0" b="0"/>
+                  <wp:docPr id="595358054" name="Picture 1"/>
                   <wp:cNvGraphicFramePr>
                     <a:graphicFrameLocks xmlns:a="http://schemas.openxmlformats.org/drawingml/2006/main" noChangeAspect="1"/>
                   </wp:cNvGraphicFramePr>
@@ -659,7 +736,7 @@
                     <a:graphicData uri="http://schemas.openxmlformats.org/drawingml/2006/picture">
                       <pic:pic xmlns:pic="http://schemas.openxmlformats.org/drawingml/2006/picture">
                         <pic:nvPicPr>
-                          <pic:cNvPr id="1347007219" name=""/>
+                          <pic:cNvPr id="595358054" name=""/>
                           <pic:cNvPicPr/>
                         </pic:nvPicPr>
                         <pic:blipFill>
@@ -671,7 +748,7 @@
                         <pic:spPr>
                           <a:xfrm>
                             <a:off x="0" y="0"/>
-                            <a:ext cx="5943600" cy="412115"/>
+                            <a:ext cx="5943600" cy="1794510"/>
                           </a:xfrm>
                           <a:prstGeom prst="rect">
                             <a:avLst/>
@@ -684,6 +761,13 @@
               </w:drawing>
             </w:r>
           </w:p>
+          <w:p>
+            <w:pPr>
+              <w:rPr>
+                <w:rFonts w:ascii="Times New Roman" w:hAnsi="Times New Roman" w:cs="Times New Roman"/>
+              </w:rPr>
+            </w:pPr>
+          </w:p>
         </w:tc>
         <w:tc>
           <w:tcPr>
@@ -718,7 +802,7 @@
               <w:rPr>
                 <w:rFonts w:ascii="Times New Roman" w:hAnsi="Times New Roman" w:cs="Times New Roman"/>
               </w:rPr>
-              <w:t>7</w:t>
+              <w:t>8</w:t>
             </w:r>
           </w:p>
         </w:tc>
@@ -737,7 +821,7 @@
               <w:rPr>
                 <w:rFonts w:ascii="Times New Roman" w:hAnsi="Times New Roman" w:cs="Times New Roman"/>
               </w:rPr>
-              <w:t>docker compose logs -f</w:t>
+              <w:t>docker compose build</w:t>
             </w:r>
           </w:p>
           <w:p>
@@ -751,10 +835,10 @@
                 <w:rFonts w:ascii="Times New Roman" w:hAnsi="Times New Roman" w:cs="Times New Roman"/>
               </w:rPr>
               <w:drawing>
-                <wp:inline distT="0" distB="0" distL="0" distR="0" wp14:anchorId="21703EA7" wp14:editId="6A204E9A">
-                  <wp:extent cx="5943600" cy="394335"/>
-                  <wp:effectExtent l="0" t="0" r="0" b="5715"/>
-                  <wp:docPr id="437249952" name="Picture 1"/>
+                <wp:inline distT="0" distB="0" distL="0" distR="0" wp14:anchorId="6DE43B02" wp14:editId="67B8BF26">
+                  <wp:extent cx="5943600" cy="220345"/>
+                  <wp:effectExtent l="0" t="0" r="0" b="8255"/>
+                  <wp:docPr id="1106242567" name="Picture 1"/>
                   <wp:cNvGraphicFramePr>
                     <a:graphicFrameLocks xmlns:a="http://schemas.openxmlformats.org/drawingml/2006/main" noChangeAspect="1"/>
                   </wp:cNvGraphicFramePr>
@@ -762,7 +846,7 @@
                     <a:graphicData uri="http://schemas.openxmlformats.org/drawingml/2006/picture">
                       <pic:pic xmlns:pic="http://schemas.openxmlformats.org/drawingml/2006/picture">
                         <pic:nvPicPr>
-                          <pic:cNvPr id="437249952" name=""/>
+                          <pic:cNvPr id="1106242567" name=""/>
                           <pic:cNvPicPr/>
                         </pic:nvPicPr>
                         <pic:blipFill>
@@ -774,7 +858,7 @@
                         <pic:spPr>
                           <a:xfrm>
                             <a:off x="0" y="0"/>
-                            <a:ext cx="5943600" cy="394335"/>
+                            <a:ext cx="5943600" cy="220345"/>
                           </a:xfrm>
                           <a:prstGeom prst="rect">
                             <a:avLst/>
@@ -787,6 +871,13 @@
               </w:drawing>
             </w:r>
           </w:p>
+          <w:p>
+            <w:pPr>
+              <w:rPr>
+                <w:rFonts w:ascii="Times New Roman" w:hAnsi="Times New Roman" w:cs="Times New Roman"/>
+              </w:rPr>
+            </w:pPr>
+          </w:p>
         </w:tc>
         <w:tc>
           <w:tcPr>
@@ -821,7 +912,7 @@
               <w:rPr>
                 <w:rFonts w:ascii="Times New Roman" w:hAnsi="Times New Roman" w:cs="Times New Roman"/>
               </w:rPr>
-              <w:t>8</w:t>
+              <w:t>9</w:t>
             </w:r>
           </w:p>
         </w:tc>
@@ -840,7 +931,7 @@
               <w:rPr>
                 <w:rFonts w:ascii="Times New Roman" w:hAnsi="Times New Roman" w:cs="Times New Roman"/>
               </w:rPr>
-              <w:t>docker compose build</w:t>
+              <w:t>docker compose exec &lt;service_name&gt; &lt;command&gt;</w:t>
             </w:r>
           </w:p>
           <w:p>
@@ -854,10 +945,10 @@
                 <w:rFonts w:ascii="Times New Roman" w:hAnsi="Times New Roman" w:cs="Times New Roman"/>
               </w:rPr>
               <w:drawing>
-                <wp:inline distT="0" distB="0" distL="0" distR="0" wp14:anchorId="58E876F4" wp14:editId="692858BD">
-                  <wp:extent cx="5943600" cy="2700655"/>
-                  <wp:effectExtent l="0" t="0" r="0" b="4445"/>
-                  <wp:docPr id="2060143995" name="Picture 1"/>
+                <wp:inline distT="0" distB="0" distL="0" distR="0" wp14:anchorId="3C44D205" wp14:editId="3739E23C">
+                  <wp:extent cx="5943600" cy="445135"/>
+                  <wp:effectExtent l="0" t="0" r="0" b="0"/>
+                  <wp:docPr id="174452354" name="Picture 1"/>
                   <wp:cNvGraphicFramePr>
                     <a:graphicFrameLocks xmlns:a="http://schemas.openxmlformats.org/drawingml/2006/main" noChangeAspect="1"/>
                   </wp:cNvGraphicFramePr>
@@ -865,7 +956,7 @@
                     <a:graphicData uri="http://schemas.openxmlformats.org/drawingml/2006/picture">
                       <pic:pic xmlns:pic="http://schemas.openxmlformats.org/drawingml/2006/picture">
                         <pic:nvPicPr>
-                          <pic:cNvPr id="2060143995" name=""/>
+                          <pic:cNvPr id="174452354" name=""/>
                           <pic:cNvPicPr/>
                         </pic:nvPicPr>
                         <pic:blipFill>
@@ -877,7 +968,7 @@
                         <pic:spPr>
                           <a:xfrm>
                             <a:off x="0" y="0"/>
-                            <a:ext cx="5943600" cy="2700655"/>
+                            <a:ext cx="5943600" cy="445135"/>
                           </a:xfrm>
                           <a:prstGeom prst="rect">
                             <a:avLst/>
@@ -890,6 +981,13 @@
               </w:drawing>
             </w:r>
           </w:p>
+          <w:p>
+            <w:pPr>
+              <w:rPr>
+                <w:rFonts w:ascii="Times New Roman" w:hAnsi="Times New Roman" w:cs="Times New Roman"/>
+              </w:rPr>
+            </w:pPr>
+          </w:p>
         </w:tc>
         <w:tc>
           <w:tcPr>
@@ -924,7 +1022,7 @@
               <w:rPr>
                 <w:rFonts w:ascii="Times New Roman" w:hAnsi="Times New Roman" w:cs="Times New Roman"/>
               </w:rPr>
-              <w:t>9</w:t>
+              <w:t>10</w:t>
             </w:r>
           </w:p>
         </w:tc>
@@ -943,15 +1041,55 @@
               <w:rPr>
                 <w:rFonts w:ascii="Times New Roman" w:hAnsi="Times New Roman" w:cs="Times New Roman"/>
               </w:rPr>
-              <w:t>docker compose exec &lt;service_name&gt; &lt;command&gt;</w:t>
-            </w:r>
-          </w:p>
-          <w:p>
-            <w:pPr>
-              <w:rPr>
-                <w:rFonts w:ascii="Times New Roman" w:hAnsi="Times New Roman" w:cs="Times New Roman"/>
-              </w:rPr>
-            </w:pPr>
+              <w:t>docker compose down -v</w:t>
+            </w:r>
+          </w:p>
+          <w:p>
+            <w:pPr>
+              <w:rPr>
+                <w:rFonts w:ascii="Times New Roman" w:hAnsi="Times New Roman" w:cs="Times New Roman"/>
+              </w:rPr>
+            </w:pPr>
+            <w:r>
+              <w:rPr>
+                <w:rFonts w:ascii="Times New Roman" w:hAnsi="Times New Roman" w:cs="Times New Roman"/>
+              </w:rPr>
+              <w:drawing>
+                <wp:inline distT="0" distB="0" distL="0" distR="0" wp14:anchorId="2493F057" wp14:editId="5A78067B">
+                  <wp:extent cx="5943600" cy="1027430"/>
+                  <wp:effectExtent l="0" t="0" r="0" b="1270"/>
+                  <wp:docPr id="960493468" name="Picture 1"/>
+                  <wp:cNvGraphicFramePr>
+                    <a:graphicFrameLocks xmlns:a="http://schemas.openxmlformats.org/drawingml/2006/main" noChangeAspect="1"/>
+                  </wp:cNvGraphicFramePr>
+                  <a:graphic xmlns:a="http://schemas.openxmlformats.org/drawingml/2006/main">
+                    <a:graphicData uri="http://schemas.openxmlformats.org/drawingml/2006/picture">
+                      <pic:pic xmlns:pic="http://schemas.openxmlformats.org/drawingml/2006/picture">
+                        <pic:nvPicPr>
+                          <pic:cNvPr id="960493468" name=""/>
+                          <pic:cNvPicPr/>
+                        </pic:nvPicPr>
+                        <pic:blipFill>
+                          <a:blip r:embed="rId13"/>
+                          <a:stretch>
+                            <a:fillRect/>
+                          </a:stretch>
+                        </pic:blipFill>
+                        <pic:spPr>
+                          <a:xfrm>
+                            <a:off x="0" y="0"/>
+                            <a:ext cx="5943600" cy="1027430"/>
+                          </a:xfrm>
+                          <a:prstGeom prst="rect">
+                            <a:avLst/>
+                          </a:prstGeom>
+                        </pic:spPr>
+                      </pic:pic>
+                    </a:graphicData>
+                  </a:graphic>
+                </wp:inline>
+              </w:drawing>
+            </w:r>
           </w:p>
         </w:tc>
         <w:tc>
@@ -987,7 +1125,7 @@
               <w:rPr>
                 <w:rFonts w:ascii="Times New Roman" w:hAnsi="Times New Roman" w:cs="Times New Roman"/>
               </w:rPr>
-              <w:t>10</w:t>
+              <w:t>11</w:t>
             </w:r>
           </w:p>
         </w:tc>
@@ -1006,7 +1144,54 @@
               <w:rPr>
                 <w:rFonts w:ascii="Times New Roman" w:hAnsi="Times New Roman" w:cs="Times New Roman"/>
               </w:rPr>
-              <w:t>docker compose down -v</w:t>
+              <w:t>docker compose run &lt;service_name&gt; &lt;command&gt;</w:t>
+            </w:r>
+          </w:p>
+          <w:p>
+            <w:pPr>
+              <w:rPr>
+                <w:rFonts w:ascii="Times New Roman" w:hAnsi="Times New Roman" w:cs="Times New Roman"/>
+              </w:rPr>
+            </w:pPr>
+            <w:r>
+              <w:rPr>
+                <w:rFonts w:ascii="Times New Roman" w:hAnsi="Times New Roman" w:cs="Times New Roman"/>
+              </w:rPr>
+              <w:drawing>
+                <wp:inline distT="0" distB="0" distL="0" distR="0" wp14:anchorId="2A98C4F1" wp14:editId="41C81BCE">
+                  <wp:extent cx="5943600" cy="710565"/>
+                  <wp:effectExtent l="0" t="0" r="0" b="0"/>
+                  <wp:docPr id="591848639" name="Picture 1"/>
+                  <wp:cNvGraphicFramePr>
+                    <a:graphicFrameLocks xmlns:a="http://schemas.openxmlformats.org/drawingml/2006/main" noChangeAspect="1"/>
+                  </wp:cNvGraphicFramePr>
+                  <a:graphic xmlns:a="http://schemas.openxmlformats.org/drawingml/2006/main">
+                    <a:graphicData uri="http://schemas.openxmlformats.org/drawingml/2006/picture">
+                      <pic:pic xmlns:pic="http://schemas.openxmlformats.org/drawingml/2006/picture">
+                        <pic:nvPicPr>
+                          <pic:cNvPr id="591848639" name=""/>
+                          <pic:cNvPicPr/>
+                        </pic:nvPicPr>
+                        <pic:blipFill>
+                          <a:blip r:embed="rId14"/>
+                          <a:stretch>
+                            <a:fillRect/>
+                          </a:stretch>
+                        </pic:blipFill>
+                        <pic:spPr>
+                          <a:xfrm>
+                            <a:off x="0" y="0"/>
+                            <a:ext cx="5943600" cy="710565"/>
+                          </a:xfrm>
+                          <a:prstGeom prst="rect">
+                            <a:avLst/>
+                          </a:prstGeom>
+                        </pic:spPr>
+                      </pic:pic>
+                    </a:graphicData>
+                  </a:graphic>
+                </wp:inline>
+              </w:drawing>
             </w:r>
           </w:p>
         </w:tc>
@@ -1043,7 +1228,8 @@
               <w:rPr>
                 <w:rFonts w:ascii="Times New Roman" w:hAnsi="Times New Roman" w:cs="Times New Roman"/>
               </w:rPr>
-              <w:t>11</w:t>
+              <w:lastRenderedPageBreak/>
+              <w:t>12</w:t>
             </w:r>
           </w:p>
         </w:tc>
@@ -1062,7 +1248,7 @@
               <w:rPr>
                 <w:rFonts w:ascii="Times New Roman" w:hAnsi="Times New Roman" w:cs="Times New Roman"/>
               </w:rPr>
-              <w:t>docker compose run &lt;service_name&gt; &lt;command&gt;</w:t>
+              <w:t>docker compose stop &lt;service_name&gt;</w:t>
             </w:r>
           </w:p>
         </w:tc>
@@ -1099,7 +1285,7 @@
               <w:rPr>
                 <w:rFonts w:ascii="Times New Roman" w:hAnsi="Times New Roman" w:cs="Times New Roman"/>
               </w:rPr>
-              <w:t>12</w:t>
+              <w:t>13</w:t>
             </w:r>
           </w:p>
         </w:tc>
@@ -1118,7 +1304,54 @@
               <w:rPr>
                 <w:rFonts w:ascii="Times New Roman" w:hAnsi="Times New Roman" w:cs="Times New Roman"/>
               </w:rPr>
-              <w:t>docker compose stop &lt;service_name&gt;</w:t>
+              <w:t>docker compose rm &lt;service_name&gt;</w:t>
+            </w:r>
+          </w:p>
+          <w:p>
+            <w:pPr>
+              <w:rPr>
+                <w:rFonts w:ascii="Times New Roman" w:hAnsi="Times New Roman" w:cs="Times New Roman"/>
+              </w:rPr>
+            </w:pPr>
+            <w:r>
+              <w:rPr>
+                <w:rFonts w:ascii="Times New Roman" w:hAnsi="Times New Roman" w:cs="Times New Roman"/>
+              </w:rPr>
+              <w:drawing>
+                <wp:inline distT="0" distB="0" distL="0" distR="0" wp14:anchorId="4770945D" wp14:editId="44F88FB9">
+                  <wp:extent cx="5943600" cy="801370"/>
+                  <wp:effectExtent l="0" t="0" r="0" b="0"/>
+                  <wp:docPr id="538921777" name="Picture 1"/>
+                  <wp:cNvGraphicFramePr>
+                    <a:graphicFrameLocks xmlns:a="http://schemas.openxmlformats.org/drawingml/2006/main" noChangeAspect="1"/>
+                  </wp:cNvGraphicFramePr>
+                  <a:graphic xmlns:a="http://schemas.openxmlformats.org/drawingml/2006/main">
+                    <a:graphicData uri="http://schemas.openxmlformats.org/drawingml/2006/picture">
+                      <pic:pic xmlns:pic="http://schemas.openxmlformats.org/drawingml/2006/picture">
+                        <pic:nvPicPr>
+                          <pic:cNvPr id="538921777" name=""/>
+                          <pic:cNvPicPr/>
+                        </pic:nvPicPr>
+                        <pic:blipFill>
+                          <a:blip r:embed="rId15"/>
+                          <a:stretch>
+                            <a:fillRect/>
+                          </a:stretch>
+                        </pic:blipFill>
+                        <pic:spPr>
+                          <a:xfrm>
+                            <a:off x="0" y="0"/>
+                            <a:ext cx="5943600" cy="801370"/>
+                          </a:xfrm>
+                          <a:prstGeom prst="rect">
+                            <a:avLst/>
+                          </a:prstGeom>
+                        </pic:spPr>
+                      </pic:pic>
+                    </a:graphicData>
+                  </a:graphic>
+                </wp:inline>
+              </w:drawing>
             </w:r>
           </w:p>
         </w:tc>
@@ -1155,7 +1388,7 @@
               <w:rPr>
                 <w:rFonts w:ascii="Times New Roman" w:hAnsi="Times New Roman" w:cs="Times New Roman"/>
               </w:rPr>
-              <w:t>13</w:t>
+              <w:t>14</w:t>
             </w:r>
           </w:p>
         </w:tc>
@@ -1174,7 +1407,54 @@
               <w:rPr>
                 <w:rFonts w:ascii="Times New Roman" w:hAnsi="Times New Roman" w:cs="Times New Roman"/>
               </w:rPr>
-              <w:t>docker compose rm &lt;service_name&gt;</w:t>
+              <w:t>docker compose config</w:t>
+            </w:r>
+          </w:p>
+          <w:p>
+            <w:pPr>
+              <w:rPr>
+                <w:rFonts w:ascii="Times New Roman" w:hAnsi="Times New Roman" w:cs="Times New Roman"/>
+              </w:rPr>
+            </w:pPr>
+            <w:r>
+              <w:rPr>
+                <w:rFonts w:ascii="Times New Roman" w:hAnsi="Times New Roman" w:cs="Times New Roman"/>
+              </w:rPr>
+              <w:drawing>
+                <wp:inline distT="0" distB="0" distL="0" distR="0" wp14:anchorId="6E220D92" wp14:editId="2B6F8D35">
+                  <wp:extent cx="5943600" cy="918210"/>
+                  <wp:effectExtent l="0" t="0" r="0" b="0"/>
+                  <wp:docPr id="1441459747" name="Picture 1"/>
+                  <wp:cNvGraphicFramePr>
+                    <a:graphicFrameLocks xmlns:a="http://schemas.openxmlformats.org/drawingml/2006/main" noChangeAspect="1"/>
+                  </wp:cNvGraphicFramePr>
+                  <a:graphic xmlns:a="http://schemas.openxmlformats.org/drawingml/2006/main">
+                    <a:graphicData uri="http://schemas.openxmlformats.org/drawingml/2006/picture">
+                      <pic:pic xmlns:pic="http://schemas.openxmlformats.org/drawingml/2006/picture">
+                        <pic:nvPicPr>
+                          <pic:cNvPr id="1441459747" name=""/>
+                          <pic:cNvPicPr/>
+                        </pic:nvPicPr>
+                        <pic:blipFill>
+                          <a:blip r:embed="rId16"/>
+                          <a:stretch>
+                            <a:fillRect/>
+                          </a:stretch>
+                        </pic:blipFill>
+                        <pic:spPr>
+                          <a:xfrm>
+                            <a:off x="0" y="0"/>
+                            <a:ext cx="5943600" cy="918210"/>
+                          </a:xfrm>
+                          <a:prstGeom prst="rect">
+                            <a:avLst/>
+                          </a:prstGeom>
+                        </pic:spPr>
+                      </pic:pic>
+                    </a:graphicData>
+                  </a:graphic>
+                </wp:inline>
+              </w:drawing>
             </w:r>
           </w:p>
         </w:tc>
@@ -1211,7 +1491,7 @@
               <w:rPr>
                 <w:rFonts w:ascii="Times New Roman" w:hAnsi="Times New Roman" w:cs="Times New Roman"/>
               </w:rPr>
-              <w:t>14</w:t>
+              <w:t>15</w:t>
             </w:r>
           </w:p>
         </w:tc>
@@ -1230,63 +1510,66 @@
               <w:rPr>
                 <w:rFonts w:ascii="Times New Roman" w:hAnsi="Times New Roman" w:cs="Times New Roman"/>
               </w:rPr>
-              <w:t>docker compose config</w:t>
-            </w:r>
-          </w:p>
-        </w:tc>
-        <w:tc>
-          <w:tcPr>
-            <w:tcW w:w="0" w:type="auto"/>
-            <w:hideMark/>
-          </w:tcPr>
-          <w:p>
-            <w:pPr>
-              <w:rPr>
-                <w:rFonts w:ascii="Times New Roman" w:hAnsi="Times New Roman" w:cs="Times New Roman"/>
-              </w:rPr>
-            </w:pPr>
-          </w:p>
-        </w:tc>
-      </w:tr>
-      <w:tr>
-        <w:trPr>
-          <w:trHeight w:val="315"/>
-        </w:trPr>
-        <w:tc>
-          <w:tcPr>
-            <w:tcW w:w="567" w:type="dxa"/>
-            <w:hideMark/>
-          </w:tcPr>
-          <w:p>
-            <w:pPr>
-              <w:rPr>
-                <w:rFonts w:ascii="Times New Roman" w:hAnsi="Times New Roman" w:cs="Times New Roman"/>
-              </w:rPr>
-            </w:pPr>
-            <w:r>
-              <w:rPr>
-                <w:rFonts w:ascii="Times New Roman" w:hAnsi="Times New Roman" w:cs="Times New Roman"/>
-              </w:rPr>
-              <w:t>15</w:t>
-            </w:r>
-          </w:p>
-        </w:tc>
-        <w:tc>
-          <w:tcPr>
-            <w:tcW w:w="0" w:type="auto"/>
-            <w:hideMark/>
-          </w:tcPr>
-          <w:p>
-            <w:pPr>
-              <w:rPr>
-                <w:rFonts w:ascii="Times New Roman" w:hAnsi="Times New Roman" w:cs="Times New Roman"/>
-              </w:rPr>
-            </w:pPr>
-            <w:r>
-              <w:rPr>
-                <w:rFonts w:ascii="Times New Roman" w:hAnsi="Times New Roman" w:cs="Times New Roman"/>
-              </w:rPr>
-              <w:t>docker compose up -d --build</w:t>
+              <w:t xml:space="preserve">docker compose up -d </w:t>
+            </w:r>
+            <w:r>
+              <w:rPr>
+                <w:rFonts w:ascii="Times New Roman" w:hAnsi="Times New Roman" w:cs="Times New Roman"/>
+              </w:rPr>
+              <w:t>–</w:t>
+            </w:r>
+            <w:r>
+              <w:rPr>
+                <w:rFonts w:ascii="Times New Roman" w:hAnsi="Times New Roman" w:cs="Times New Roman"/>
+              </w:rPr>
+              <w:t>build</w:t>
+            </w:r>
+          </w:p>
+          <w:p>
+            <w:pPr>
+              <w:rPr>
+                <w:rFonts w:ascii="Times New Roman" w:hAnsi="Times New Roman" w:cs="Times New Roman"/>
+              </w:rPr>
+            </w:pPr>
+            <w:r>
+              <w:rPr>
+                <w:rFonts w:ascii="Times New Roman" w:hAnsi="Times New Roman" w:cs="Times New Roman"/>
+              </w:rPr>
+              <w:drawing>
+                <wp:inline distT="0" distB="0" distL="0" distR="0" wp14:anchorId="585FD0FC" wp14:editId="6EE12DFC">
+                  <wp:extent cx="5943600" cy="421005"/>
+                  <wp:effectExtent l="0" t="0" r="0" b="0"/>
+                  <wp:docPr id="2027862919" name="Picture 1"/>
+                  <wp:cNvGraphicFramePr>
+                    <a:graphicFrameLocks xmlns:a="http://schemas.openxmlformats.org/drawingml/2006/main" noChangeAspect="1"/>
+                  </wp:cNvGraphicFramePr>
+                  <a:graphic xmlns:a="http://schemas.openxmlformats.org/drawingml/2006/main">
+                    <a:graphicData uri="http://schemas.openxmlformats.org/drawingml/2006/picture">
+                      <pic:pic xmlns:pic="http://schemas.openxmlformats.org/drawingml/2006/picture">
+                        <pic:nvPicPr>
+                          <pic:cNvPr id="2027862919" name=""/>
+                          <pic:cNvPicPr/>
+                        </pic:nvPicPr>
+                        <pic:blipFill>
+                          <a:blip r:embed="rId17"/>
+                          <a:stretch>
+                            <a:fillRect/>
+                          </a:stretch>
+                        </pic:blipFill>
+                        <pic:spPr>
+                          <a:xfrm>
+                            <a:off x="0" y="0"/>
+                            <a:ext cx="5943600" cy="421005"/>
+                          </a:xfrm>
+                          <a:prstGeom prst="rect">
+                            <a:avLst/>
+                          </a:prstGeom>
+                        </pic:spPr>
+                      </pic:pic>
+                    </a:graphicData>
+                  </a:graphic>
+                </wp:inline>
+              </w:drawing>
             </w:r>
           </w:p>
         </w:tc>
@@ -1925,11 +2208,13 @@
   <w:style w:type="character" w:default="1" w:styleId="DefaultParagraphFont">
     <w:name w:val="Default Paragraph Font"/>
     <w:uiPriority w:val="1"/>
+    <w:semiHidden/>
     <w:unhideWhenUsed/>
   </w:style>
   <w:style w:type="table" w:default="1" w:styleId="TableNormal">
     <w:name w:val="Normal Table"/>
     <w:uiPriority w:val="99"/>
+    <w:semiHidden/>
     <w:unhideWhenUsed/>
     <w:tblPr>
       <w:tblInd w:w="0" w:type="dxa"/>

</xml_diff>